<commit_message>
docs: update vault with POCACITO board intel, MoUs, partner agreements
- Session context updated with POCACITO board composition (Brendan,
  Max, Alexx Baerwald Simard, Felicia Naranjo Martinez) — 50/50 vote,
  unanimous required, Alexx is the holdout (conflict-adjacency concern)
- Sprint notes updated: Michael Shank now advising, board risk noted
- Updated MoUs (EcoAction + Ecoclub Rivne) with legal panel revisions
- Added partner agreements (EcoAction, Ecoclub Rivne, Greenpeace UA)
- Added Ecoaction project report, MoU changes summary
- Added partner project CSV template for bulk intake
- Added collateral content brief

Co-Authored-By: Claude Opus 4.6 <noreply@anthropic.com>
</commit_message>
<xml_diff>
--- a/Partner_MoU_EcoAction.docx
+++ b/Partner_MoU_EcoAction.docx
@@ -485,7 +485,7 @@
         </w:numPr>
       </w:pPr>
       <w:r>
-        <w:t xml:space="preserve">Promptly notify Hromada in writing if the Partner becomes aware or has reasonable grounds to believe that project funds have been misused, misallocated, or diverted from their intended purpose.</w:t>
+        <w:t xml:space="preserve">Notify Hromada in writing within five (5) business days of becoming aware, or having reasonable grounds to believe, that project funds have been misused, misallocated, or diverted from their intended purpose.</w:t>
       </w:r>
     </w:p>
     <w:p>
@@ -558,7 +558,7 @@
         </w:numPr>
       </w:pPr>
       <w:r>
-        <w:t xml:space="preserve">Respond to requests from Hromada for additional information, documentation, or clarification regarding any project within fourteen (14) calendar days of the request.</w:t>
+        <w:t xml:space="preserve">Respond to requests from Hromada for additional information, documentation, or clarification regarding any project within seven (7) calendar days of the request.</w:t>
       </w:r>
     </w:p>
     <w:bookmarkEnd w:id="16"/>
@@ -604,7 +604,7 @@
         </w:numPr>
       </w:pPr>
       <w:r>
-        <w:t xml:space="preserve">Exercise reasonable due diligence to ensure that it does not engage, contract with, or facilitate the transfer of funds or resources to any individual or entity located in, or operating primarily within, any territory of Ukraine not under the effective control of the Government of Ukraine, as determined by Hromada in consultation with applicable U.S. government guidance.</w:t>
+        <w:t xml:space="preserve">Exercise reasonable due diligence to ensure that it does not engage, contract with, or facilitate the transfer of funds or resources to any individual or entity located in, or operating primarily within, any territory of Ukraine not under the effective control of the Government of Ukraine, as determined by Hromada in consultation with applicable U.S. government guidance. For the avoidance of doubt, a municipality or community that has relocated from an occupied territory to a location under effective government control shall be evaluated based on its current operating location, not its pre-displacement registration.</w:t>
       </w:r>
     </w:p>
     <w:p>
@@ -637,7 +637,7 @@
         </w:numPr>
       </w:pPr>
       <w:r>
-        <w:t xml:space="preserve">Cooperate with Hromada’s sanctions screening procedures, including providing the full legal names (in both Ukrainian and English transliteration) of municipal officials, contractors, and vendors involved in Hromada-funded projects. Such names shall be provided (i) before a project is submitted for publication on the Hromada platform, and (ii) within five (5) business days of any personnel change. Hromada shall not disburse funds for any project until sanctions screening of all identified individuals is complete.</w:t>
+        <w:t xml:space="preserve">Cooperate with Hromada’s sanctions screening procedures, including providing the full legal names (in both Ukrainian and English transliteration) of municipal officials, contractors, and vendors involved in Hromada-funded projects, to the extent known at the time. Municipal officials and other known personnel shall be provided before a project is submitted for publication on the Hromada platform. Contractors and vendors selected through procurement shall be provided within five (5) business days of their selection. The Partner shall notify Hromada within five (5) business days of any subsequent personnel change. Hromada shall not disburse funds for any project until sanctions screening of all identified individuals is complete.</w:t>
       </w:r>
     </w:p>
     <w:p>

</xml_diff>